<commit_message>
Improve report layout and chart fonts
</commit_message>
<xml_diff>
--- a/sample_output/parking-report-sample.docx
+++ b/sample_output/parking-report-sample.docx
@@ -26,7 +26,22 @@
     <w:tbl>
       <w:tblPr>
         <w:tblW w:type="auto" w:w="0"/>
+        <w:tblLayout w:type="fixed"/>
         <w:tblLook w:firstColumn="1" w:firstRow="1" w:lastColumn="0" w:lastRow="0" w:noHBand="0" w:noVBand="1" w:val="04A0"/>
+        <w:tblBorders>
+          <w:top w:val="single" w:sz="8" w:space="0" w:color="7A8A92"/>
+          <w:left w:val="single" w:sz="8" w:space="0" w:color="7A8A92"/>
+          <w:bottom w:val="single" w:sz="8" w:space="0" w:color="7A8A92"/>
+          <w:right w:val="single" w:sz="8" w:space="0" w:color="7A8A92"/>
+          <w:insideH w:val="single" w:sz="8" w:space="0" w:color="7A8A92"/>
+          <w:insideV w:val="single" w:sz="8" w:space="0" w:color="7A8A92"/>
+        </w:tblBorders>
+        <w:tblCellMar>
+          <w:top w:w="120" w:type="dxa"/>
+          <w:left w:w="120" w:type="dxa"/>
+          <w:bottom w:w="120" w:type="dxa"/>
+          <w:right w:w="120" w:type="dxa"/>
+        </w:tblCellMar>
       </w:tblPr>
       <w:tblGrid>
         <w:gridCol w:w="4680"/>
@@ -35,20 +50,44 @@
       <w:tr>
         <w:tc>
           <w:tcPr>
-            <w:tcW w:type="dxa" w:w="4680"/>
-          </w:tcPr>
-          <w:p>
-            <w:r>
+            <w:tcW w:type="dxa" w:w="3168"/>
+            <w:vAlign w:val="center"/>
+            <w:shd w:fill="DCEADF"/>
+          </w:tcPr>
+          <w:p>
+            <w:pPr>
+              <w:spacing w:after="0"/>
+              <w:jc w:val="left"/>
+            </w:pPr>
+            <w:r/>
+            <w:r>
+              <w:rPr>
+                <w:rFonts w:ascii="Arial" w:hAnsi="Arial" w:eastAsia="Microsoft YaHei"/>
+                <w:b/>
+                <w:sz w:val="20"/>
+              </w:rPr>
               <w:t>指标</w:t>
             </w:r>
           </w:p>
         </w:tc>
         <w:tc>
           <w:tcPr>
-            <w:tcW w:type="dxa" w:w="4680"/>
-          </w:tcPr>
-          <w:p>
-            <w:r>
+            <w:tcW w:type="dxa" w:w="5616"/>
+            <w:vAlign w:val="center"/>
+            <w:shd w:fill="DCEADF"/>
+          </w:tcPr>
+          <w:p>
+            <w:pPr>
+              <w:spacing w:after="0"/>
+              <w:jc w:val="left"/>
+            </w:pPr>
+            <w:r/>
+            <w:r>
+              <w:rPr>
+                <w:rFonts w:ascii="Arial" w:hAnsi="Arial" w:eastAsia="Microsoft YaHei"/>
+                <w:b/>
+                <w:sz w:val="20"/>
+              </w:rPr>
               <w:t>结果</w:t>
             </w:r>
           </w:p>
@@ -57,20 +96,42 @@
       <w:tr>
         <w:tc>
           <w:tcPr>
-            <w:tcW w:type="dxa" w:w="4680"/>
-          </w:tcPr>
-          <w:p>
-            <w:r>
+            <w:tcW w:type="dxa" w:w="3168"/>
+            <w:vAlign w:val="center"/>
+          </w:tcPr>
+          <w:p>
+            <w:pPr>
+              <w:spacing w:after="0"/>
+              <w:jc w:val="left"/>
+            </w:pPr>
+            <w:r/>
+            <w:r>
+              <w:rPr>
+                <w:rFonts w:ascii="Arial" w:hAnsi="Arial" w:eastAsia="Microsoft YaHei"/>
+                <w:b w:val="0"/>
+                <w:sz w:val="20"/>
+              </w:rPr>
               <w:t>总交易笔数</w:t>
             </w:r>
           </w:p>
         </w:tc>
         <w:tc>
           <w:tcPr>
-            <w:tcW w:type="dxa" w:w="4680"/>
-          </w:tcPr>
-          <w:p>
-            <w:r>
+            <w:tcW w:type="dxa" w:w="5616"/>
+            <w:vAlign w:val="center"/>
+          </w:tcPr>
+          <w:p>
+            <w:pPr>
+              <w:spacing w:after="0"/>
+              <w:jc w:val="left"/>
+            </w:pPr>
+            <w:r/>
+            <w:r>
+              <w:rPr>
+                <w:rFonts w:ascii="Arial" w:hAnsi="Arial" w:eastAsia="Microsoft YaHei"/>
+                <w:b w:val="0"/>
+                <w:sz w:val="20"/>
+              </w:rPr>
               <w:t>3674 笔</w:t>
             </w:r>
           </w:p>
@@ -79,20 +140,42 @@
       <w:tr>
         <w:tc>
           <w:tcPr>
-            <w:tcW w:type="dxa" w:w="4680"/>
-          </w:tcPr>
-          <w:p>
-            <w:r>
+            <w:tcW w:type="dxa" w:w="3168"/>
+            <w:vAlign w:val="center"/>
+          </w:tcPr>
+          <w:p>
+            <w:pPr>
+              <w:spacing w:after="0"/>
+              <w:jc w:val="left"/>
+            </w:pPr>
+            <w:r/>
+            <w:r>
+              <w:rPr>
+                <w:rFonts w:ascii="Arial" w:hAnsi="Arial" w:eastAsia="Microsoft YaHei"/>
+                <w:b w:val="0"/>
+                <w:sz w:val="20"/>
+              </w:rPr>
               <w:t>应收总金额</w:t>
             </w:r>
           </w:p>
         </w:tc>
         <w:tc>
           <w:tcPr>
-            <w:tcW w:type="dxa" w:w="4680"/>
-          </w:tcPr>
-          <w:p>
-            <w:r>
+            <w:tcW w:type="dxa" w:w="5616"/>
+            <w:vAlign w:val="center"/>
+          </w:tcPr>
+          <w:p>
+            <w:pPr>
+              <w:spacing w:after="0"/>
+              <w:jc w:val="left"/>
+            </w:pPr>
+            <w:r/>
+            <w:r>
+              <w:rPr>
+                <w:rFonts w:ascii="Arial" w:hAnsi="Arial" w:eastAsia="Microsoft YaHei"/>
+                <w:b w:val="0"/>
+                <w:sz w:val="20"/>
+              </w:rPr>
               <w:t>105795.00 元</w:t>
             </w:r>
           </w:p>
@@ -101,20 +184,42 @@
       <w:tr>
         <w:tc>
           <w:tcPr>
-            <w:tcW w:type="dxa" w:w="4680"/>
-          </w:tcPr>
-          <w:p>
-            <w:r>
+            <w:tcW w:type="dxa" w:w="3168"/>
+            <w:vAlign w:val="center"/>
+          </w:tcPr>
+          <w:p>
+            <w:pPr>
+              <w:spacing w:after="0"/>
+              <w:jc w:val="left"/>
+            </w:pPr>
+            <w:r/>
+            <w:r>
+              <w:rPr>
+                <w:rFonts w:ascii="Arial" w:hAnsi="Arial" w:eastAsia="Microsoft YaHei"/>
+                <w:b w:val="0"/>
+                <w:sz w:val="20"/>
+              </w:rPr>
               <w:t>实收总金额</w:t>
             </w:r>
           </w:p>
         </w:tc>
         <w:tc>
           <w:tcPr>
-            <w:tcW w:type="dxa" w:w="4680"/>
-          </w:tcPr>
-          <w:p>
-            <w:r>
+            <w:tcW w:type="dxa" w:w="5616"/>
+            <w:vAlign w:val="center"/>
+          </w:tcPr>
+          <w:p>
+            <w:pPr>
+              <w:spacing w:after="0"/>
+              <w:jc w:val="left"/>
+            </w:pPr>
+            <w:r/>
+            <w:r>
+              <w:rPr>
+                <w:rFonts w:ascii="Arial" w:hAnsi="Arial" w:eastAsia="Microsoft YaHei"/>
+                <w:b w:val="0"/>
+                <w:sz w:val="20"/>
+              </w:rPr>
               <w:t>57397.50 元</w:t>
             </w:r>
           </w:p>
@@ -123,20 +228,42 @@
       <w:tr>
         <w:tc>
           <w:tcPr>
-            <w:tcW w:type="dxa" w:w="4680"/>
-          </w:tcPr>
-          <w:p>
-            <w:r>
+            <w:tcW w:type="dxa" w:w="3168"/>
+            <w:vAlign w:val="center"/>
+          </w:tcPr>
+          <w:p>
+            <w:pPr>
+              <w:spacing w:after="0"/>
+              <w:jc w:val="left"/>
+            </w:pPr>
+            <w:r/>
+            <w:r>
+              <w:rPr>
+                <w:rFonts w:ascii="Arial" w:hAnsi="Arial" w:eastAsia="Microsoft YaHei"/>
+                <w:b w:val="0"/>
+                <w:sz w:val="20"/>
+              </w:rPr>
               <w:t>实际抵扣总额</w:t>
             </w:r>
           </w:p>
         </w:tc>
         <w:tc>
           <w:tcPr>
-            <w:tcW w:type="dxa" w:w="4680"/>
-          </w:tcPr>
-          <w:p>
-            <w:r>
+            <w:tcW w:type="dxa" w:w="5616"/>
+            <w:vAlign w:val="center"/>
+          </w:tcPr>
+          <w:p>
+            <w:pPr>
+              <w:spacing w:after="0"/>
+              <w:jc w:val="left"/>
+            </w:pPr>
+            <w:r/>
+            <w:r>
+              <w:rPr>
+                <w:rFonts w:ascii="Arial" w:hAnsi="Arial" w:eastAsia="Microsoft YaHei"/>
+                <w:b w:val="0"/>
+                <w:sz w:val="20"/>
+              </w:rPr>
               <w:t>48285.00 元</w:t>
             </w:r>
           </w:p>
@@ -145,20 +272,42 @@
       <w:tr>
         <w:tc>
           <w:tcPr>
-            <w:tcW w:type="dxa" w:w="4680"/>
-          </w:tcPr>
-          <w:p>
-            <w:r>
+            <w:tcW w:type="dxa" w:w="3168"/>
+            <w:vAlign w:val="center"/>
+          </w:tcPr>
+          <w:p>
+            <w:pPr>
+              <w:spacing w:after="0"/>
+              <w:jc w:val="left"/>
+            </w:pPr>
+            <w:r/>
+            <w:r>
+              <w:rPr>
+                <w:rFonts w:ascii="Arial" w:hAnsi="Arial" w:eastAsia="Microsoft YaHei"/>
+                <w:b w:val="0"/>
+                <w:sz w:val="20"/>
+              </w:rPr>
               <w:t>实收率</w:t>
             </w:r>
           </w:p>
         </w:tc>
         <w:tc>
           <w:tcPr>
-            <w:tcW w:type="dxa" w:w="4680"/>
-          </w:tcPr>
-          <w:p>
-            <w:r>
+            <w:tcW w:type="dxa" w:w="5616"/>
+            <w:vAlign w:val="center"/>
+          </w:tcPr>
+          <w:p>
+            <w:pPr>
+              <w:spacing w:after="0"/>
+              <w:jc w:val="left"/>
+            </w:pPr>
+            <w:r/>
+            <w:r>
+              <w:rPr>
+                <w:rFonts w:ascii="Arial" w:hAnsi="Arial" w:eastAsia="Microsoft YaHei"/>
+                <w:b w:val="0"/>
+                <w:sz w:val="20"/>
+              </w:rPr>
               <w:t>54.3%</w:t>
             </w:r>
           </w:p>
@@ -167,26 +316,49 @@
       <w:tr>
         <w:tc>
           <w:tcPr>
-            <w:tcW w:type="dxa" w:w="4680"/>
-          </w:tcPr>
-          <w:p>
-            <w:r>
+            <w:tcW w:type="dxa" w:w="3168"/>
+            <w:vAlign w:val="center"/>
+          </w:tcPr>
+          <w:p>
+            <w:pPr>
+              <w:spacing w:after="0"/>
+              <w:jc w:val="left"/>
+            </w:pPr>
+            <w:r/>
+            <w:r>
+              <w:rPr>
+                <w:rFonts w:ascii="Arial" w:hAnsi="Arial" w:eastAsia="Microsoft YaHei"/>
+                <w:b w:val="0"/>
+                <w:sz w:val="20"/>
+              </w:rPr>
               <w:t>主要支付方式</w:t>
             </w:r>
           </w:p>
         </w:tc>
         <w:tc>
           <w:tcPr>
-            <w:tcW w:type="dxa" w:w="4680"/>
-          </w:tcPr>
-          <w:p>
-            <w:r>
+            <w:tcW w:type="dxa" w:w="5616"/>
+            <w:vAlign w:val="center"/>
+          </w:tcPr>
+          <w:p>
+            <w:pPr>
+              <w:spacing w:after="0"/>
+              <w:jc w:val="left"/>
+            </w:pPr>
+            <w:r/>
+            <w:r>
+              <w:rPr>
+                <w:rFonts w:ascii="Arial" w:hAnsi="Arial" w:eastAsia="Microsoft YaHei"/>
+                <w:b w:val="0"/>
+                <w:sz w:val="20"/>
+              </w:rPr>
               <w:t>微信（1435 笔）</w:t>
             </w:r>
           </w:p>
         </w:tc>
       </w:tr>
     </w:tbl>
+    <w:p/>
     <w:p>
       <w:pPr>
         <w:pStyle w:val="3"/>
@@ -201,10 +373,957 @@
       </w:r>
     </w:p>
     <w:p>
+      <w:pPr>
+        <w:pStyle w:val="4"/>
+      </w:pPr>
+      <w:r>
+        <w:t>支付渠道</w:t>
+      </w:r>
+    </w:p>
+    <w:tbl>
+      <w:tblPr>
+        <w:tblW w:type="auto" w:w="0"/>
+        <w:tblLayout w:type="fixed"/>
+        <w:tblLook w:firstColumn="1" w:firstRow="1" w:lastColumn="0" w:lastRow="0" w:noHBand="0" w:noVBand="1" w:val="04A0"/>
+        <w:tblBorders>
+          <w:top w:val="single" w:sz="8" w:space="0" w:color="7A8A92"/>
+          <w:left w:val="single" w:sz="8" w:space="0" w:color="7A8A92"/>
+          <w:bottom w:val="single" w:sz="8" w:space="0" w:color="7A8A92"/>
+          <w:right w:val="single" w:sz="8" w:space="0" w:color="7A8A92"/>
+          <w:insideH w:val="single" w:sz="8" w:space="0" w:color="7A8A92"/>
+          <w:insideV w:val="single" w:sz="8" w:space="0" w:color="7A8A92"/>
+        </w:tblBorders>
+        <w:tblCellMar>
+          <w:top w:w="120" w:type="dxa"/>
+          <w:left w:w="120" w:type="dxa"/>
+          <w:bottom w:w="120" w:type="dxa"/>
+          <w:right w:w="120" w:type="dxa"/>
+        </w:tblCellMar>
+      </w:tblPr>
+      <w:tblGrid>
+        <w:gridCol w:w="4680"/>
+        <w:gridCol w:w="4680"/>
+      </w:tblGrid>
+      <w:tr>
+        <w:tc>
+          <w:tcPr>
+            <w:tcW w:type="dxa" w:w="4320"/>
+            <w:vAlign w:val="center"/>
+            <w:shd w:fill="DCEADF"/>
+          </w:tcPr>
+          <w:p>
+            <w:pPr>
+              <w:spacing w:after="0"/>
+              <w:jc w:val="left"/>
+            </w:pPr>
+            <w:r/>
+            <w:r>
+              <w:rPr>
+                <w:rFonts w:ascii="Arial" w:hAnsi="Arial" w:eastAsia="Microsoft YaHei"/>
+                <w:b/>
+                <w:sz w:val="20"/>
+              </w:rPr>
+              <w:t>渠道</w:t>
+            </w:r>
+          </w:p>
+        </w:tc>
+        <w:tc>
+          <w:tcPr>
+            <w:tcW w:type="dxa" w:w="4464"/>
+            <w:vAlign w:val="center"/>
+            <w:shd w:fill="DCEADF"/>
+          </w:tcPr>
+          <w:p>
+            <w:pPr>
+              <w:spacing w:after="0"/>
+              <w:jc w:val="left"/>
+            </w:pPr>
+            <w:r/>
+            <w:r>
+              <w:rPr>
+                <w:rFonts w:ascii="Arial" w:hAnsi="Arial" w:eastAsia="Microsoft YaHei"/>
+                <w:b/>
+                <w:sz w:val="20"/>
+              </w:rPr>
+              <w:t>交易笔数</w:t>
+            </w:r>
+          </w:p>
+        </w:tc>
+      </w:tr>
+      <w:tr>
+        <w:tc>
+          <w:tcPr>
+            <w:tcW w:type="dxa" w:w="4320"/>
+            <w:vAlign w:val="center"/>
+          </w:tcPr>
+          <w:p>
+            <w:pPr>
+              <w:spacing w:after="0"/>
+              <w:jc w:val="left"/>
+            </w:pPr>
+            <w:r/>
+            <w:r>
+              <w:rPr>
+                <w:rFonts w:ascii="Arial" w:hAnsi="Arial" w:eastAsia="Microsoft YaHei"/>
+                <w:b w:val="0"/>
+                <w:sz w:val="20"/>
+              </w:rPr>
+              <w:t>线上支付</w:t>
+            </w:r>
+          </w:p>
+        </w:tc>
+        <w:tc>
+          <w:tcPr>
+            <w:tcW w:type="dxa" w:w="4464"/>
+            <w:vAlign w:val="center"/>
+          </w:tcPr>
+          <w:p>
+            <w:pPr>
+              <w:spacing w:after="0"/>
+              <w:jc w:val="left"/>
+            </w:pPr>
+            <w:r/>
+            <w:r>
+              <w:rPr>
+                <w:rFonts w:ascii="Arial" w:hAnsi="Arial" w:eastAsia="Microsoft YaHei"/>
+                <w:b w:val="0"/>
+                <w:sz w:val="20"/>
+              </w:rPr>
+              <w:t>3122 笔</w:t>
+            </w:r>
+          </w:p>
+        </w:tc>
+      </w:tr>
+      <w:tr>
+        <w:tc>
+          <w:tcPr>
+            <w:tcW w:type="dxa" w:w="4320"/>
+            <w:vAlign w:val="center"/>
+          </w:tcPr>
+          <w:p>
+            <w:pPr>
+              <w:spacing w:after="0"/>
+              <w:jc w:val="left"/>
+            </w:pPr>
+            <w:r/>
+            <w:r>
+              <w:rPr>
+                <w:rFonts w:ascii="Arial" w:hAnsi="Arial" w:eastAsia="Microsoft YaHei"/>
+                <w:b w:val="0"/>
+                <w:sz w:val="20"/>
+              </w:rPr>
+              <w:t>出口贴码</w:t>
+            </w:r>
+          </w:p>
+        </w:tc>
+        <w:tc>
+          <w:tcPr>
+            <w:tcW w:type="dxa" w:w="4464"/>
+            <w:vAlign w:val="center"/>
+          </w:tcPr>
+          <w:p>
+            <w:pPr>
+              <w:spacing w:after="0"/>
+              <w:jc w:val="left"/>
+            </w:pPr>
+            <w:r/>
+            <w:r>
+              <w:rPr>
+                <w:rFonts w:ascii="Arial" w:hAnsi="Arial" w:eastAsia="Microsoft YaHei"/>
+                <w:b w:val="0"/>
+                <w:sz w:val="20"/>
+              </w:rPr>
+              <w:t>544 笔</w:t>
+            </w:r>
+          </w:p>
+        </w:tc>
+      </w:tr>
+      <w:tr>
+        <w:tc>
+          <w:tcPr>
+            <w:tcW w:type="dxa" w:w="4320"/>
+            <w:vAlign w:val="center"/>
+          </w:tcPr>
+          <w:p>
+            <w:pPr>
+              <w:spacing w:after="0"/>
+              <w:jc w:val="left"/>
+            </w:pPr>
+            <w:r/>
+            <w:r>
+              <w:rPr>
+                <w:rFonts w:ascii="Arial" w:hAnsi="Arial" w:eastAsia="Microsoft YaHei"/>
+                <w:b w:val="0"/>
+                <w:sz w:val="20"/>
+              </w:rPr>
+              <w:t>出口缴费机</w:t>
+            </w:r>
+          </w:p>
+        </w:tc>
+        <w:tc>
+          <w:tcPr>
+            <w:tcW w:type="dxa" w:w="4464"/>
+            <w:vAlign w:val="center"/>
+          </w:tcPr>
+          <w:p>
+            <w:pPr>
+              <w:spacing w:after="0"/>
+              <w:jc w:val="left"/>
+            </w:pPr>
+            <w:r/>
+            <w:r>
+              <w:rPr>
+                <w:rFonts w:ascii="Arial" w:hAnsi="Arial" w:eastAsia="Microsoft YaHei"/>
+                <w:b w:val="0"/>
+                <w:sz w:val="20"/>
+              </w:rPr>
+              <w:t>5 笔</w:t>
+            </w:r>
+          </w:p>
+        </w:tc>
+      </w:tr>
+      <w:tr>
+        <w:tc>
+          <w:tcPr>
+            <w:tcW w:type="dxa" w:w="4320"/>
+            <w:vAlign w:val="center"/>
+          </w:tcPr>
+          <w:p>
+            <w:pPr>
+              <w:spacing w:after="0"/>
+              <w:jc w:val="left"/>
+            </w:pPr>
+            <w:r/>
+            <w:r>
+              <w:rPr>
+                <w:rFonts w:ascii="Arial" w:hAnsi="Arial" w:eastAsia="Microsoft YaHei"/>
+                <w:b w:val="0"/>
+                <w:sz w:val="20"/>
+              </w:rPr>
+              <w:t>遥控放行登记</w:t>
+            </w:r>
+          </w:p>
+        </w:tc>
+        <w:tc>
+          <w:tcPr>
+            <w:tcW w:type="dxa" w:w="4464"/>
+            <w:vAlign w:val="center"/>
+          </w:tcPr>
+          <w:p>
+            <w:pPr>
+              <w:spacing w:after="0"/>
+              <w:jc w:val="left"/>
+            </w:pPr>
+            <w:r/>
+            <w:r>
+              <w:rPr>
+                <w:rFonts w:ascii="Arial" w:hAnsi="Arial" w:eastAsia="Microsoft YaHei"/>
+                <w:b w:val="0"/>
+                <w:sz w:val="20"/>
+              </w:rPr>
+              <w:t>3 笔</w:t>
+            </w:r>
+          </w:p>
+        </w:tc>
+      </w:tr>
+    </w:tbl>
+    <w:p/>
+    <w:p>
+      <w:pPr>
+        <w:pStyle w:val="4"/>
+      </w:pPr>
+      <w:r>
+        <w:t>支付方式</w:t>
+      </w:r>
+    </w:p>
+    <w:tbl>
+      <w:tblPr>
+        <w:tblW w:type="auto" w:w="0"/>
+        <w:tblLayout w:type="fixed"/>
+        <w:tblLook w:firstColumn="1" w:firstRow="1" w:lastColumn="0" w:lastRow="0" w:noHBand="0" w:noVBand="1" w:val="04A0"/>
+        <w:tblBorders>
+          <w:top w:val="single" w:sz="8" w:space="0" w:color="7A8A92"/>
+          <w:left w:val="single" w:sz="8" w:space="0" w:color="7A8A92"/>
+          <w:bottom w:val="single" w:sz="8" w:space="0" w:color="7A8A92"/>
+          <w:right w:val="single" w:sz="8" w:space="0" w:color="7A8A92"/>
+          <w:insideH w:val="single" w:sz="8" w:space="0" w:color="7A8A92"/>
+          <w:insideV w:val="single" w:sz="8" w:space="0" w:color="7A8A92"/>
+        </w:tblBorders>
+        <w:tblCellMar>
+          <w:top w:w="120" w:type="dxa"/>
+          <w:left w:w="120" w:type="dxa"/>
+          <w:bottom w:w="120" w:type="dxa"/>
+          <w:right w:w="120" w:type="dxa"/>
+        </w:tblCellMar>
+      </w:tblPr>
+      <w:tblGrid>
+        <w:gridCol w:w="4680"/>
+        <w:gridCol w:w="4680"/>
+      </w:tblGrid>
+      <w:tr>
+        <w:tc>
+          <w:tcPr>
+            <w:tcW w:type="dxa" w:w="4320"/>
+            <w:vAlign w:val="center"/>
+            <w:shd w:fill="DCEADF"/>
+          </w:tcPr>
+          <w:p>
+            <w:pPr>
+              <w:spacing w:after="0"/>
+              <w:jc w:val="left"/>
+            </w:pPr>
+            <w:r/>
+            <w:r>
+              <w:rPr>
+                <w:rFonts w:ascii="Arial" w:hAnsi="Arial" w:eastAsia="Microsoft YaHei"/>
+                <w:b/>
+                <w:sz w:val="20"/>
+              </w:rPr>
+              <w:t>支付方式</w:t>
+            </w:r>
+          </w:p>
+        </w:tc>
+        <w:tc>
+          <w:tcPr>
+            <w:tcW w:type="dxa" w:w="4464"/>
+            <w:vAlign w:val="center"/>
+            <w:shd w:fill="DCEADF"/>
+          </w:tcPr>
+          <w:p>
+            <w:pPr>
+              <w:spacing w:after="0"/>
+              <w:jc w:val="left"/>
+            </w:pPr>
+            <w:r/>
+            <w:r>
+              <w:rPr>
+                <w:rFonts w:ascii="Arial" w:hAnsi="Arial" w:eastAsia="Microsoft YaHei"/>
+                <w:b/>
+                <w:sz w:val="20"/>
+              </w:rPr>
+              <w:t>交易笔数</w:t>
+            </w:r>
+          </w:p>
+        </w:tc>
+      </w:tr>
+      <w:tr>
+        <w:tc>
+          <w:tcPr>
+            <w:tcW w:type="dxa" w:w="4320"/>
+            <w:vAlign w:val="center"/>
+          </w:tcPr>
+          <w:p>
+            <w:pPr>
+              <w:spacing w:after="0"/>
+              <w:jc w:val="left"/>
+            </w:pPr>
+            <w:r/>
+            <w:r>
+              <w:rPr>
+                <w:rFonts w:ascii="Arial" w:hAnsi="Arial" w:eastAsia="Microsoft YaHei"/>
+                <w:b w:val="0"/>
+                <w:sz w:val="20"/>
+              </w:rPr>
+              <w:t>微信</w:t>
+            </w:r>
+          </w:p>
+        </w:tc>
+        <w:tc>
+          <w:tcPr>
+            <w:tcW w:type="dxa" w:w="4464"/>
+            <w:vAlign w:val="center"/>
+          </w:tcPr>
+          <w:p>
+            <w:pPr>
+              <w:spacing w:after="0"/>
+              <w:jc w:val="left"/>
+            </w:pPr>
+            <w:r/>
+            <w:r>
+              <w:rPr>
+                <w:rFonts w:ascii="Arial" w:hAnsi="Arial" w:eastAsia="Microsoft YaHei"/>
+                <w:b w:val="0"/>
+                <w:sz w:val="20"/>
+              </w:rPr>
+              <w:t>1435 笔</w:t>
+            </w:r>
+          </w:p>
+        </w:tc>
+      </w:tr>
+      <w:tr>
+        <w:tc>
+          <w:tcPr>
+            <w:tcW w:type="dxa" w:w="4320"/>
+            <w:vAlign w:val="center"/>
+          </w:tcPr>
+          <w:p>
+            <w:pPr>
+              <w:spacing w:after="0"/>
+              <w:jc w:val="left"/>
+            </w:pPr>
+            <w:r/>
+            <w:r>
+              <w:rPr>
+                <w:rFonts w:ascii="Arial" w:hAnsi="Arial" w:eastAsia="Microsoft YaHei"/>
+                <w:b w:val="0"/>
+                <w:sz w:val="20"/>
+              </w:rPr>
+              <w:t>会员积分</w:t>
+            </w:r>
+          </w:p>
+        </w:tc>
+        <w:tc>
+          <w:tcPr>
+            <w:tcW w:type="dxa" w:w="4464"/>
+            <w:vAlign w:val="center"/>
+          </w:tcPr>
+          <w:p>
+            <w:pPr>
+              <w:spacing w:after="0"/>
+              <w:jc w:val="left"/>
+            </w:pPr>
+            <w:r/>
+            <w:r>
+              <w:rPr>
+                <w:rFonts w:ascii="Arial" w:hAnsi="Arial" w:eastAsia="Microsoft YaHei"/>
+                <w:b w:val="0"/>
+                <w:sz w:val="20"/>
+              </w:rPr>
+              <w:t>1396 笔</w:t>
+            </w:r>
+          </w:p>
+        </w:tc>
+      </w:tr>
+      <w:tr>
+        <w:tc>
+          <w:tcPr>
+            <w:tcW w:type="dxa" w:w="4320"/>
+            <w:vAlign w:val="center"/>
+          </w:tcPr>
+          <w:p>
+            <w:pPr>
+              <w:spacing w:after="0"/>
+              <w:jc w:val="left"/>
+            </w:pPr>
+            <w:r/>
+            <w:r>
+              <w:rPr>
+                <w:rFonts w:ascii="Arial" w:hAnsi="Arial" w:eastAsia="Microsoft YaHei"/>
+                <w:b w:val="0"/>
+                <w:sz w:val="20"/>
+              </w:rPr>
+              <w:t>优惠券</w:t>
+            </w:r>
+          </w:p>
+        </w:tc>
+        <w:tc>
+          <w:tcPr>
+            <w:tcW w:type="dxa" w:w="4464"/>
+            <w:vAlign w:val="center"/>
+          </w:tcPr>
+          <w:p>
+            <w:pPr>
+              <w:spacing w:after="0"/>
+              <w:jc w:val="left"/>
+            </w:pPr>
+            <w:r/>
+            <w:r>
+              <w:rPr>
+                <w:rFonts w:ascii="Arial" w:hAnsi="Arial" w:eastAsia="Microsoft YaHei"/>
+                <w:b w:val="0"/>
+                <w:sz w:val="20"/>
+              </w:rPr>
+              <w:t>777 笔</w:t>
+            </w:r>
+          </w:p>
+        </w:tc>
+      </w:tr>
+      <w:tr>
+        <w:tc>
+          <w:tcPr>
+            <w:tcW w:type="dxa" w:w="4320"/>
+            <w:vAlign w:val="center"/>
+          </w:tcPr>
+          <w:p>
+            <w:pPr>
+              <w:spacing w:after="0"/>
+              <w:jc w:val="left"/>
+            </w:pPr>
+            <w:r/>
+            <w:r>
+              <w:rPr>
+                <w:rFonts w:ascii="Arial" w:hAnsi="Arial" w:eastAsia="Microsoft YaHei"/>
+                <w:b w:val="0"/>
+                <w:sz w:val="20"/>
+              </w:rPr>
+              <w:t>支付宝</w:t>
+            </w:r>
+          </w:p>
+        </w:tc>
+        <w:tc>
+          <w:tcPr>
+            <w:tcW w:type="dxa" w:w="4464"/>
+            <w:vAlign w:val="center"/>
+          </w:tcPr>
+          <w:p>
+            <w:pPr>
+              <w:spacing w:after="0"/>
+              <w:jc w:val="left"/>
+            </w:pPr>
+            <w:r/>
+            <w:r>
+              <w:rPr>
+                <w:rFonts w:ascii="Arial" w:hAnsi="Arial" w:eastAsia="Microsoft YaHei"/>
+                <w:b w:val="0"/>
+                <w:sz w:val="20"/>
+              </w:rPr>
+              <w:t>63 笔</w:t>
+            </w:r>
+          </w:p>
+        </w:tc>
+      </w:tr>
+      <w:tr>
+        <w:tc>
+          <w:tcPr>
+            <w:tcW w:type="dxa" w:w="4320"/>
+            <w:vAlign w:val="center"/>
+          </w:tcPr>
+          <w:p>
+            <w:pPr>
+              <w:spacing w:after="0"/>
+              <w:jc w:val="left"/>
+            </w:pPr>
+            <w:r/>
+            <w:r>
+              <w:rPr>
+                <w:rFonts w:ascii="Arial" w:hAnsi="Arial" w:eastAsia="Microsoft YaHei"/>
+                <w:b w:val="0"/>
+                <w:sz w:val="20"/>
+              </w:rPr>
+              <w:t>现金</w:t>
+            </w:r>
+          </w:p>
+        </w:tc>
+        <w:tc>
+          <w:tcPr>
+            <w:tcW w:type="dxa" w:w="4464"/>
+            <w:vAlign w:val="center"/>
+          </w:tcPr>
+          <w:p>
+            <w:pPr>
+              <w:spacing w:after="0"/>
+              <w:jc w:val="left"/>
+            </w:pPr>
+            <w:r/>
+            <w:r>
+              <w:rPr>
+                <w:rFonts w:ascii="Arial" w:hAnsi="Arial" w:eastAsia="Microsoft YaHei"/>
+                <w:b w:val="0"/>
+                <w:sz w:val="20"/>
+              </w:rPr>
+              <w:t>3 笔</w:t>
+            </w:r>
+          </w:p>
+        </w:tc>
+      </w:tr>
+    </w:tbl>
+    <w:p/>
+    <w:p>
+      <w:pPr>
+        <w:pStyle w:val="4"/>
+      </w:pPr>
+      <w:r>
+        <w:t>停车时长分布</w:t>
+      </w:r>
+    </w:p>
+    <w:tbl>
+      <w:tblPr>
+        <w:tblW w:type="auto" w:w="0"/>
+        <w:tblLayout w:type="fixed"/>
+        <w:tblLook w:firstColumn="1" w:firstRow="1" w:lastColumn="0" w:lastRow="0" w:noHBand="0" w:noVBand="1" w:val="04A0"/>
+        <w:tblBorders>
+          <w:top w:val="single" w:sz="8" w:space="0" w:color="7A8A92"/>
+          <w:left w:val="single" w:sz="8" w:space="0" w:color="7A8A92"/>
+          <w:bottom w:val="single" w:sz="8" w:space="0" w:color="7A8A92"/>
+          <w:right w:val="single" w:sz="8" w:space="0" w:color="7A8A92"/>
+          <w:insideH w:val="single" w:sz="8" w:space="0" w:color="7A8A92"/>
+          <w:insideV w:val="single" w:sz="8" w:space="0" w:color="7A8A92"/>
+        </w:tblBorders>
+        <w:tblCellMar>
+          <w:top w:w="120" w:type="dxa"/>
+          <w:left w:w="120" w:type="dxa"/>
+          <w:bottom w:w="120" w:type="dxa"/>
+          <w:right w:w="120" w:type="dxa"/>
+        </w:tblCellMar>
+      </w:tblPr>
+      <w:tblGrid>
+        <w:gridCol w:w="4680"/>
+        <w:gridCol w:w="4680"/>
+      </w:tblGrid>
+      <w:tr>
+        <w:tc>
+          <w:tcPr>
+            <w:tcW w:type="dxa" w:w="4320"/>
+            <w:vAlign w:val="center"/>
+            <w:shd w:fill="DCEADF"/>
+          </w:tcPr>
+          <w:p>
+            <w:pPr>
+              <w:spacing w:after="0"/>
+              <w:jc w:val="left"/>
+            </w:pPr>
+            <w:r/>
+            <w:r>
+              <w:rPr>
+                <w:rFonts w:ascii="Arial" w:hAnsi="Arial" w:eastAsia="Microsoft YaHei"/>
+                <w:b/>
+                <w:sz w:val="20"/>
+              </w:rPr>
+              <w:t>时长区间（小时）</w:t>
+            </w:r>
+          </w:p>
+        </w:tc>
+        <w:tc>
+          <w:tcPr>
+            <w:tcW w:type="dxa" w:w="4464"/>
+            <w:vAlign w:val="center"/>
+            <w:shd w:fill="DCEADF"/>
+          </w:tcPr>
+          <w:p>
+            <w:pPr>
+              <w:spacing w:after="0"/>
+              <w:jc w:val="left"/>
+            </w:pPr>
+            <w:r/>
+            <w:r>
+              <w:rPr>
+                <w:rFonts w:ascii="Arial" w:hAnsi="Arial" w:eastAsia="Microsoft YaHei"/>
+                <w:b/>
+                <w:sz w:val="20"/>
+              </w:rPr>
+              <w:t>交易笔数</w:t>
+            </w:r>
+          </w:p>
+        </w:tc>
+      </w:tr>
+      <w:tr>
+        <w:tc>
+          <w:tcPr>
+            <w:tcW w:type="dxa" w:w="4320"/>
+            <w:vAlign w:val="center"/>
+          </w:tcPr>
+          <w:p>
+            <w:pPr>
+              <w:spacing w:after="0"/>
+              <w:jc w:val="left"/>
+            </w:pPr>
+            <w:r/>
+            <w:r>
+              <w:rPr>
+                <w:rFonts w:ascii="Arial" w:hAnsi="Arial" w:eastAsia="Microsoft YaHei"/>
+                <w:b w:val="0"/>
+                <w:sz w:val="20"/>
+              </w:rPr>
+              <w:t>0-2</w:t>
+            </w:r>
+          </w:p>
+        </w:tc>
+        <w:tc>
+          <w:tcPr>
+            <w:tcW w:type="dxa" w:w="4464"/>
+            <w:vAlign w:val="center"/>
+          </w:tcPr>
+          <w:p>
+            <w:pPr>
+              <w:spacing w:after="0"/>
+              <w:jc w:val="left"/>
+            </w:pPr>
+            <w:r/>
+            <w:r>
+              <w:rPr>
+                <w:rFonts w:ascii="Arial" w:hAnsi="Arial" w:eastAsia="Microsoft YaHei"/>
+                <w:b w:val="0"/>
+                <w:sz w:val="20"/>
+              </w:rPr>
+              <w:t>1491 笔</w:t>
+            </w:r>
+          </w:p>
+        </w:tc>
+      </w:tr>
+      <w:tr>
+        <w:tc>
+          <w:tcPr>
+            <w:tcW w:type="dxa" w:w="4320"/>
+            <w:vAlign w:val="center"/>
+          </w:tcPr>
+          <w:p>
+            <w:pPr>
+              <w:spacing w:after="0"/>
+              <w:jc w:val="left"/>
+            </w:pPr>
+            <w:r/>
+            <w:r>
+              <w:rPr>
+                <w:rFonts w:ascii="Arial" w:hAnsi="Arial" w:eastAsia="Microsoft YaHei"/>
+                <w:b w:val="0"/>
+                <w:sz w:val="20"/>
+              </w:rPr>
+              <w:t>2-4</w:t>
+            </w:r>
+          </w:p>
+        </w:tc>
+        <w:tc>
+          <w:tcPr>
+            <w:tcW w:type="dxa" w:w="4464"/>
+            <w:vAlign w:val="center"/>
+          </w:tcPr>
+          <w:p>
+            <w:pPr>
+              <w:spacing w:after="0"/>
+              <w:jc w:val="left"/>
+            </w:pPr>
+            <w:r/>
+            <w:r>
+              <w:rPr>
+                <w:rFonts w:ascii="Arial" w:hAnsi="Arial" w:eastAsia="Microsoft YaHei"/>
+                <w:b w:val="0"/>
+                <w:sz w:val="20"/>
+              </w:rPr>
+              <w:t>1271 笔</w:t>
+            </w:r>
+          </w:p>
+        </w:tc>
+      </w:tr>
+      <w:tr>
+        <w:tc>
+          <w:tcPr>
+            <w:tcW w:type="dxa" w:w="4320"/>
+            <w:vAlign w:val="center"/>
+          </w:tcPr>
+          <w:p>
+            <w:pPr>
+              <w:spacing w:after="0"/>
+              <w:jc w:val="left"/>
+            </w:pPr>
+            <w:r/>
+            <w:r>
+              <w:rPr>
+                <w:rFonts w:ascii="Arial" w:hAnsi="Arial" w:eastAsia="Microsoft YaHei"/>
+                <w:b w:val="0"/>
+                <w:sz w:val="20"/>
+              </w:rPr>
+              <w:t>4-6</w:t>
+            </w:r>
+          </w:p>
+        </w:tc>
+        <w:tc>
+          <w:tcPr>
+            <w:tcW w:type="dxa" w:w="4464"/>
+            <w:vAlign w:val="center"/>
+          </w:tcPr>
+          <w:p>
+            <w:pPr>
+              <w:spacing w:after="0"/>
+              <w:jc w:val="left"/>
+            </w:pPr>
+            <w:r/>
+            <w:r>
+              <w:rPr>
+                <w:rFonts w:ascii="Arial" w:hAnsi="Arial" w:eastAsia="Microsoft YaHei"/>
+                <w:b w:val="0"/>
+                <w:sz w:val="20"/>
+              </w:rPr>
+              <w:t>573 笔</w:t>
+            </w:r>
+          </w:p>
+        </w:tc>
+      </w:tr>
+      <w:tr>
+        <w:tc>
+          <w:tcPr>
+            <w:tcW w:type="dxa" w:w="4320"/>
+            <w:vAlign w:val="center"/>
+          </w:tcPr>
+          <w:p>
+            <w:pPr>
+              <w:spacing w:after="0"/>
+              <w:jc w:val="left"/>
+            </w:pPr>
+            <w:r/>
+            <w:r>
+              <w:rPr>
+                <w:rFonts w:ascii="Arial" w:hAnsi="Arial" w:eastAsia="Microsoft YaHei"/>
+                <w:b w:val="0"/>
+                <w:sz w:val="20"/>
+              </w:rPr>
+              <w:t>6-8</w:t>
+            </w:r>
+          </w:p>
+        </w:tc>
+        <w:tc>
+          <w:tcPr>
+            <w:tcW w:type="dxa" w:w="4464"/>
+            <w:vAlign w:val="center"/>
+          </w:tcPr>
+          <w:p>
+            <w:pPr>
+              <w:spacing w:after="0"/>
+              <w:jc w:val="left"/>
+            </w:pPr>
+            <w:r/>
+            <w:r>
+              <w:rPr>
+                <w:rFonts w:ascii="Arial" w:hAnsi="Arial" w:eastAsia="Microsoft YaHei"/>
+                <w:b w:val="0"/>
+                <w:sz w:val="20"/>
+              </w:rPr>
+              <w:t>146 笔</w:t>
+            </w:r>
+          </w:p>
+        </w:tc>
+      </w:tr>
+      <w:tr>
+        <w:tc>
+          <w:tcPr>
+            <w:tcW w:type="dxa" w:w="4320"/>
+            <w:vAlign w:val="center"/>
+          </w:tcPr>
+          <w:p>
+            <w:pPr>
+              <w:spacing w:after="0"/>
+              <w:jc w:val="left"/>
+            </w:pPr>
+            <w:r/>
+            <w:r>
+              <w:rPr>
+                <w:rFonts w:ascii="Arial" w:hAnsi="Arial" w:eastAsia="Microsoft YaHei"/>
+                <w:b w:val="0"/>
+                <w:sz w:val="20"/>
+              </w:rPr>
+              <w:t>8-10</w:t>
+            </w:r>
+          </w:p>
+        </w:tc>
+        <w:tc>
+          <w:tcPr>
+            <w:tcW w:type="dxa" w:w="4464"/>
+            <w:vAlign w:val="center"/>
+          </w:tcPr>
+          <w:p>
+            <w:pPr>
+              <w:spacing w:after="0"/>
+              <w:jc w:val="left"/>
+            </w:pPr>
+            <w:r/>
+            <w:r>
+              <w:rPr>
+                <w:rFonts w:ascii="Arial" w:hAnsi="Arial" w:eastAsia="Microsoft YaHei"/>
+                <w:b w:val="0"/>
+                <w:sz w:val="20"/>
+              </w:rPr>
+              <w:t>80 笔</w:t>
+            </w:r>
+          </w:p>
+        </w:tc>
+      </w:tr>
+      <w:tr>
+        <w:tc>
+          <w:tcPr>
+            <w:tcW w:type="dxa" w:w="4320"/>
+            <w:vAlign w:val="center"/>
+          </w:tcPr>
+          <w:p>
+            <w:pPr>
+              <w:spacing w:after="0"/>
+              <w:jc w:val="left"/>
+            </w:pPr>
+            <w:r/>
+            <w:r>
+              <w:rPr>
+                <w:rFonts w:ascii="Arial" w:hAnsi="Arial" w:eastAsia="Microsoft YaHei"/>
+                <w:b w:val="0"/>
+                <w:sz w:val="20"/>
+              </w:rPr>
+              <w:t>10-12</w:t>
+            </w:r>
+          </w:p>
+        </w:tc>
+        <w:tc>
+          <w:tcPr>
+            <w:tcW w:type="dxa" w:w="4464"/>
+            <w:vAlign w:val="center"/>
+          </w:tcPr>
+          <w:p>
+            <w:pPr>
+              <w:spacing w:after="0"/>
+              <w:jc w:val="left"/>
+            </w:pPr>
+            <w:r/>
+            <w:r>
+              <w:rPr>
+                <w:rFonts w:ascii="Arial" w:hAnsi="Arial" w:eastAsia="Microsoft YaHei"/>
+                <w:b w:val="0"/>
+                <w:sz w:val="20"/>
+              </w:rPr>
+              <w:t>35 笔</w:t>
+            </w:r>
+          </w:p>
+        </w:tc>
+      </w:tr>
+      <w:tr>
+        <w:tc>
+          <w:tcPr>
+            <w:tcW w:type="dxa" w:w="4320"/>
+            <w:vAlign w:val="center"/>
+          </w:tcPr>
+          <w:p>
+            <w:pPr>
+              <w:spacing w:after="0"/>
+              <w:jc w:val="left"/>
+            </w:pPr>
+            <w:r/>
+            <w:r>
+              <w:rPr>
+                <w:rFonts w:ascii="Arial" w:hAnsi="Arial" w:eastAsia="Microsoft YaHei"/>
+                <w:b w:val="0"/>
+                <w:sz w:val="20"/>
+              </w:rPr>
+              <w:t>12+</w:t>
+            </w:r>
+          </w:p>
+        </w:tc>
+        <w:tc>
+          <w:tcPr>
+            <w:tcW w:type="dxa" w:w="4464"/>
+            <w:vAlign w:val="center"/>
+          </w:tcPr>
+          <w:p>
+            <w:pPr>
+              <w:spacing w:after="0"/>
+              <w:jc w:val="left"/>
+            </w:pPr>
+            <w:r/>
+            <w:r>
+              <w:rPr>
+                <w:rFonts w:ascii="Arial" w:hAnsi="Arial" w:eastAsia="Microsoft YaHei"/>
+                <w:b w:val="0"/>
+                <w:sz w:val="20"/>
+              </w:rPr>
+              <w:t>78 笔</w:t>
+            </w:r>
+          </w:p>
+        </w:tc>
+      </w:tr>
+    </w:tbl>
+    <w:p/>
+    <w:p>
+      <w:pPr>
+        <w:jc w:val="center"/>
+      </w:pPr>
       <w:r>
         <w:drawing>
           <wp:inline xmlns:a="http://schemas.openxmlformats.org/drawingml/2006/main" xmlns:pic="http://schemas.openxmlformats.org/drawingml/2006/picture">
-            <wp:extent cx="5669280" cy="3188970"/>
+            <wp:extent cx="5029200" cy="2117558"/>
             <wp:docPr id="1" name="Picture 1"/>
             <wp:cNvGraphicFramePr>
               <a:graphicFrameLocks noChangeAspect="1"/>
@@ -213,7 +1332,7 @@
               <a:graphicData uri="http://schemas.openxmlformats.org/drawingml/2006/picture">
                 <pic:pic>
                   <pic:nvPicPr>
-                    <pic:cNvPr id="0" name="sample-output-payment-methods.png"/>
+                    <pic:cNvPr id="0" name="sample-payment-methods.png"/>
                     <pic:cNvPicPr/>
                   </pic:nvPicPr>
                   <pic:blipFill>
@@ -225,7 +1344,7 @@
                   <pic:spPr>
                     <a:xfrm>
                       <a:off x="0" y="0"/>
-                      <a:ext cx="5669280" cy="3188970"/>
+                      <a:ext cx="5029200" cy="2117558"/>
                     </a:xfrm>
                     <a:prstGeom prst="rect"/>
                   </pic:spPr>
@@ -237,10 +1356,13 @@
       </w:r>
     </w:p>
     <w:p>
+      <w:pPr>
+        <w:jc w:val="center"/>
+      </w:pPr>
       <w:r>
         <w:drawing>
           <wp:inline xmlns:a="http://schemas.openxmlformats.org/drawingml/2006/main" xmlns:pic="http://schemas.openxmlformats.org/drawingml/2006/picture">
-            <wp:extent cx="5669280" cy="3188970"/>
+            <wp:extent cx="5029200" cy="2117558"/>
             <wp:docPr id="2" name="Picture 2"/>
             <wp:cNvGraphicFramePr>
               <a:graphicFrameLocks noChangeAspect="1"/>
@@ -249,7 +1371,7 @@
               <a:graphicData uri="http://schemas.openxmlformats.org/drawingml/2006/picture">
                 <pic:pic>
                   <pic:nvPicPr>
-                    <pic:cNvPr id="0" name="sample-output-duration-bins.png"/>
+                    <pic:cNvPr id="0" name="sample-duration-bins.png"/>
                     <pic:cNvPicPr/>
                   </pic:nvPicPr>
                   <pic:blipFill>
@@ -261,7 +1383,7 @@
                   <pic:spPr>
                     <a:xfrm>
                       <a:off x="0" y="0"/>
-                      <a:ext cx="5669280" cy="3188970"/>
+                      <a:ext cx="5029200" cy="2117558"/>
                     </a:xfrm>
                     <a:prstGeom prst="rect"/>
                   </pic:spPr>
@@ -648,8 +1770,8 @@
     <w:qFormat/>
     <w:uiPriority w:val="0"/>
     <w:rPr>
-      <w:rFonts w:ascii="Noto Sans CJK SC" w:hAnsi="Noto Sans CJK SC" w:eastAsia="Noto Sans CJK SC" w:cs="Noto Sans CJK SC"/>
-      <w:sz w:val="22"/>
+      <w:rFonts w:ascii="Arial" w:hAnsi="Arial" w:eastAsia="Microsoft YaHei" w:cs="Noto Sans CJK SC"/>
+      <w:sz w:val="21"/>
       <w:szCs w:val="22"/>
     </w:rPr>
   </w:style>
@@ -663,7 +1785,7 @@
       <w:outlineLvl w:val="0"/>
     </w:pPr>
     <w:rPr>
-      <w:rFonts w:ascii="Noto Sans CJK SC" w:hAnsi="Noto Sans CJK SC" w:eastAsia="Noto Sans CJK SC" w:cs="Noto Sans CJK SC"/>
+      <w:rFonts w:ascii="Arial" w:hAnsi="Arial" w:eastAsia="Microsoft YaHei" w:cs="Noto Sans CJK SC"/>
       <w:b/>
       <w:bCs/>
       <w:color w:val="1F4E79"/>
@@ -681,7 +1803,7 @@
       <w:outlineLvl w:val="1"/>
     </w:pPr>
     <w:rPr>
-      <w:rFonts w:ascii="Noto Sans CJK SC" w:hAnsi="Noto Sans CJK SC" w:eastAsia="Noto Sans CJK SC" w:cs="Noto Sans CJK SC"/>
+      <w:rFonts w:ascii="Arial" w:hAnsi="Arial" w:eastAsia="Microsoft YaHei" w:cs="Noto Sans CJK SC"/>
       <w:b/>
       <w:bCs/>
       <w:color w:val="2E5E8C"/>
@@ -695,7 +1817,7 @@
     <w:qFormat/>
     <w:uiPriority w:val="0"/>
     <w:rPr>
-      <w:rFonts w:ascii="Noto Sans CJK SC" w:hAnsi="Noto Sans CJK SC" w:eastAsia="Noto Sans CJK SC" w:cs="Noto Sans CJK SC"/>
+      <w:rFonts w:ascii="Arial" w:hAnsi="Arial" w:eastAsia="Microsoft YaHei" w:cs="Noto Sans CJK SC"/>
       <w:color w:val="1F4D78"/>
       <w:sz w:val="24"/>
       <w:szCs w:val="24"/>

</xml_diff>

<commit_message>
Add report info section, time-of-day charts, and deeper observations
Align the rendered DOCX with the provided template:
- Compute data period and hourly entry/charge distributions deterministically
- Add 报告信息 block (data period + generation time)
- Render daily entry/charge distribution charts under the parking-duration section
- Drop the template's leftover placeholder chart after clearing the body
- Surface revenue-leakage insight in supplementary observations (deduction share, discount exposure, long stays)
- Refresh sample report and ignore local download/ artifacts

Co-Authored-By: Claude Opus 4.8 <noreply@anthropic.com>
</commit_message>
<xml_diff>
--- a/sample_output/parking-report-sample.docx
+++ b/sample_output/parking-report-sample.docx
@@ -12,7 +12,7 @@
     </w:p>
     <w:p>
       <w:r>
-        <w:t>本期共 3674 笔交易，实收率 54.3%，主要支付方式为微信。整体收入结构清晰，但抵扣规模需要持续跟踪。</w:t>
+        <w:t>本期共 3674 笔交易，应收 105795.00 元、实收 57397.50 元，实收率 54.3%，主要支付方式为微信。实收率偏低主要源于 48285.00 元抵扣，抵扣与免费敞口需重点跟踪。</w:t>
       </w:r>
     </w:p>
     <w:p>
@@ -20,7 +20,7 @@
         <w:pStyle w:val="3"/>
       </w:pPr>
       <w:r>
-        <w:t>一、核心指标</w:t>
+        <w:t>报告信息</w:t>
       </w:r>
     </w:p>
     <w:tbl>
@@ -66,7 +66,7 @@
                 <w:b/>
                 <w:sz w:val="20"/>
               </w:rPr>
-              <w:t>指标</w:t>
+              <w:t>项目</w:t>
             </w:r>
           </w:p>
         </w:tc>
@@ -88,7 +88,7 @@
                 <w:b/>
                 <w:sz w:val="20"/>
               </w:rPr>
-              <w:t>结果</w:t>
+              <w:t>内容</w:t>
             </w:r>
           </w:p>
         </w:tc>
@@ -111,7 +111,7 @@
                 <w:b w:val="0"/>
                 <w:sz w:val="20"/>
               </w:rPr>
-              <w:t>总交易笔数</w:t>
+              <w:t>数据周期</w:t>
             </w:r>
           </w:p>
         </w:tc>
@@ -132,7 +132,7 @@
                 <w:b w:val="0"/>
                 <w:sz w:val="20"/>
               </w:rPr>
-              <w:t>3674 笔</w:t>
+              <w:t>2026-04-01 至 2026-04-30</w:t>
             </w:r>
           </w:p>
         </w:tc>
@@ -155,7 +155,7 @@
                 <w:b w:val="0"/>
                 <w:sz w:val="20"/>
               </w:rPr>
-              <w:t>应收总金额</w:t>
+              <w:t>生成时间</w:t>
             </w:r>
           </w:p>
         </w:tc>
@@ -176,183 +176,7 @@
                 <w:b w:val="0"/>
                 <w:sz w:val="20"/>
               </w:rPr>
-              <w:t>105795.00 元</w:t>
-            </w:r>
-          </w:p>
-        </w:tc>
-      </w:tr>
-      <w:tr>
-        <w:tc>
-          <w:tcPr>
-            <w:tcW w:type="dxa" w:w="3168"/>
-            <w:vAlign w:val="center"/>
-          </w:tcPr>
-          <w:p>
-            <w:pPr>
-              <w:spacing w:after="0"/>
-              <w:jc w:val="left"/>
-            </w:pPr>
-            <w:r/>
-            <w:r>
-              <w:rPr>
-                <w:rFonts w:ascii="Arial" w:hAnsi="Arial" w:eastAsia="Microsoft YaHei"/>
-                <w:b w:val="0"/>
-                <w:sz w:val="20"/>
-              </w:rPr>
-              <w:t>实收总金额</w:t>
-            </w:r>
-          </w:p>
-        </w:tc>
-        <w:tc>
-          <w:tcPr>
-            <w:tcW w:type="dxa" w:w="5616"/>
-            <w:vAlign w:val="center"/>
-          </w:tcPr>
-          <w:p>
-            <w:pPr>
-              <w:spacing w:after="0"/>
-              <w:jc w:val="left"/>
-            </w:pPr>
-            <w:r/>
-            <w:r>
-              <w:rPr>
-                <w:rFonts w:ascii="Arial" w:hAnsi="Arial" w:eastAsia="Microsoft YaHei"/>
-                <w:b w:val="0"/>
-                <w:sz w:val="20"/>
-              </w:rPr>
-              <w:t>57397.50 元</w:t>
-            </w:r>
-          </w:p>
-        </w:tc>
-      </w:tr>
-      <w:tr>
-        <w:tc>
-          <w:tcPr>
-            <w:tcW w:type="dxa" w:w="3168"/>
-            <w:vAlign w:val="center"/>
-          </w:tcPr>
-          <w:p>
-            <w:pPr>
-              <w:spacing w:after="0"/>
-              <w:jc w:val="left"/>
-            </w:pPr>
-            <w:r/>
-            <w:r>
-              <w:rPr>
-                <w:rFonts w:ascii="Arial" w:hAnsi="Arial" w:eastAsia="Microsoft YaHei"/>
-                <w:b w:val="0"/>
-                <w:sz w:val="20"/>
-              </w:rPr>
-              <w:t>实际抵扣总额</w:t>
-            </w:r>
-          </w:p>
-        </w:tc>
-        <w:tc>
-          <w:tcPr>
-            <w:tcW w:type="dxa" w:w="5616"/>
-            <w:vAlign w:val="center"/>
-          </w:tcPr>
-          <w:p>
-            <w:pPr>
-              <w:spacing w:after="0"/>
-              <w:jc w:val="left"/>
-            </w:pPr>
-            <w:r/>
-            <w:r>
-              <w:rPr>
-                <w:rFonts w:ascii="Arial" w:hAnsi="Arial" w:eastAsia="Microsoft YaHei"/>
-                <w:b w:val="0"/>
-                <w:sz w:val="20"/>
-              </w:rPr>
-              <w:t>48285.00 元</w:t>
-            </w:r>
-          </w:p>
-        </w:tc>
-      </w:tr>
-      <w:tr>
-        <w:tc>
-          <w:tcPr>
-            <w:tcW w:type="dxa" w:w="3168"/>
-            <w:vAlign w:val="center"/>
-          </w:tcPr>
-          <w:p>
-            <w:pPr>
-              <w:spacing w:after="0"/>
-              <w:jc w:val="left"/>
-            </w:pPr>
-            <w:r/>
-            <w:r>
-              <w:rPr>
-                <w:rFonts w:ascii="Arial" w:hAnsi="Arial" w:eastAsia="Microsoft YaHei"/>
-                <w:b w:val="0"/>
-                <w:sz w:val="20"/>
-              </w:rPr>
-              <w:t>实收率</w:t>
-            </w:r>
-          </w:p>
-        </w:tc>
-        <w:tc>
-          <w:tcPr>
-            <w:tcW w:type="dxa" w:w="5616"/>
-            <w:vAlign w:val="center"/>
-          </w:tcPr>
-          <w:p>
-            <w:pPr>
-              <w:spacing w:after="0"/>
-              <w:jc w:val="left"/>
-            </w:pPr>
-            <w:r/>
-            <w:r>
-              <w:rPr>
-                <w:rFonts w:ascii="Arial" w:hAnsi="Arial" w:eastAsia="Microsoft YaHei"/>
-                <w:b w:val="0"/>
-                <w:sz w:val="20"/>
-              </w:rPr>
-              <w:t>54.3%</w:t>
-            </w:r>
-          </w:p>
-        </w:tc>
-      </w:tr>
-      <w:tr>
-        <w:tc>
-          <w:tcPr>
-            <w:tcW w:type="dxa" w:w="3168"/>
-            <w:vAlign w:val="center"/>
-          </w:tcPr>
-          <w:p>
-            <w:pPr>
-              <w:spacing w:after="0"/>
-              <w:jc w:val="left"/>
-            </w:pPr>
-            <w:r/>
-            <w:r>
-              <w:rPr>
-                <w:rFonts w:ascii="Arial" w:hAnsi="Arial" w:eastAsia="Microsoft YaHei"/>
-                <w:b w:val="0"/>
-                <w:sz w:val="20"/>
-              </w:rPr>
-              <w:t>主要支付方式</w:t>
-            </w:r>
-          </w:p>
-        </w:tc>
-        <w:tc>
-          <w:tcPr>
-            <w:tcW w:type="dxa" w:w="5616"/>
-            <w:vAlign w:val="center"/>
-          </w:tcPr>
-          <w:p>
-            <w:pPr>
-              <w:spacing w:after="0"/>
-              <w:jc w:val="left"/>
-            </w:pPr>
-            <w:r/>
-            <w:r>
-              <w:rPr>
-                <w:rFonts w:ascii="Arial" w:hAnsi="Arial" w:eastAsia="Microsoft YaHei"/>
-                <w:b w:val="0"/>
-                <w:sz w:val="20"/>
-              </w:rPr>
-              <w:t>微信（1435 笔）</w:t>
+              <w:t>2026-06-13 11:46:28</w:t>
             </w:r>
           </w:p>
         </w:tc>
@@ -364,12 +188,351 @@
         <w:pStyle w:val="3"/>
       </w:pPr>
       <w:r>
-        <w:t>二、交易画像</w:t>
+        <w:t>一、关键指标（硬性数字）</w:t>
       </w:r>
     </w:p>
+    <w:tbl>
+      <w:tblPr>
+        <w:tblW w:type="auto" w:w="0"/>
+        <w:tblLayout w:type="fixed"/>
+        <w:tblLook w:firstColumn="1" w:firstRow="1" w:lastColumn="0" w:lastRow="0" w:noHBand="0" w:noVBand="1" w:val="04A0"/>
+        <w:tblBorders>
+          <w:top w:val="single" w:sz="8" w:space="0" w:color="7A8A92"/>
+          <w:left w:val="single" w:sz="8" w:space="0" w:color="7A8A92"/>
+          <w:bottom w:val="single" w:sz="8" w:space="0" w:color="7A8A92"/>
+          <w:right w:val="single" w:sz="8" w:space="0" w:color="7A8A92"/>
+          <w:insideH w:val="single" w:sz="8" w:space="0" w:color="7A8A92"/>
+          <w:insideV w:val="single" w:sz="8" w:space="0" w:color="7A8A92"/>
+        </w:tblBorders>
+        <w:tblCellMar>
+          <w:top w:w="120" w:type="dxa"/>
+          <w:left w:w="120" w:type="dxa"/>
+          <w:bottom w:w="120" w:type="dxa"/>
+          <w:right w:w="120" w:type="dxa"/>
+        </w:tblCellMar>
+      </w:tblPr>
+      <w:tblGrid>
+        <w:gridCol w:w="4680"/>
+        <w:gridCol w:w="4680"/>
+      </w:tblGrid>
+      <w:tr>
+        <w:tc>
+          <w:tcPr>
+            <w:tcW w:type="dxa" w:w="3168"/>
+            <w:vAlign w:val="center"/>
+            <w:shd w:fill="DCEADF"/>
+          </w:tcPr>
+          <w:p>
+            <w:pPr>
+              <w:spacing w:after="0"/>
+              <w:jc w:val="left"/>
+            </w:pPr>
+            <w:r/>
+            <w:r>
+              <w:rPr>
+                <w:rFonts w:ascii="Arial" w:hAnsi="Arial" w:eastAsia="Microsoft YaHei"/>
+                <w:b/>
+                <w:sz w:val="20"/>
+              </w:rPr>
+              <w:t>指标</w:t>
+            </w:r>
+          </w:p>
+        </w:tc>
+        <w:tc>
+          <w:tcPr>
+            <w:tcW w:type="dxa" w:w="5616"/>
+            <w:vAlign w:val="center"/>
+            <w:shd w:fill="DCEADF"/>
+          </w:tcPr>
+          <w:p>
+            <w:pPr>
+              <w:spacing w:after="0"/>
+              <w:jc w:val="left"/>
+            </w:pPr>
+            <w:r/>
+            <w:r>
+              <w:rPr>
+                <w:rFonts w:ascii="Arial" w:hAnsi="Arial" w:eastAsia="Microsoft YaHei"/>
+                <w:b/>
+                <w:sz w:val="20"/>
+              </w:rPr>
+              <w:t>结果</w:t>
+            </w:r>
+          </w:p>
+        </w:tc>
+      </w:tr>
+      <w:tr>
+        <w:tc>
+          <w:tcPr>
+            <w:tcW w:type="dxa" w:w="3168"/>
+            <w:vAlign w:val="center"/>
+          </w:tcPr>
+          <w:p>
+            <w:pPr>
+              <w:spacing w:after="0"/>
+              <w:jc w:val="left"/>
+            </w:pPr>
+            <w:r/>
+            <w:r>
+              <w:rPr>
+                <w:rFonts w:ascii="Arial" w:hAnsi="Arial" w:eastAsia="Microsoft YaHei"/>
+                <w:b w:val="0"/>
+                <w:sz w:val="20"/>
+              </w:rPr>
+              <w:t>总交易笔数</w:t>
+            </w:r>
+          </w:p>
+        </w:tc>
+        <w:tc>
+          <w:tcPr>
+            <w:tcW w:type="dxa" w:w="5616"/>
+            <w:vAlign w:val="center"/>
+          </w:tcPr>
+          <w:p>
+            <w:pPr>
+              <w:spacing w:after="0"/>
+              <w:jc w:val="left"/>
+            </w:pPr>
+            <w:r/>
+            <w:r>
+              <w:rPr>
+                <w:rFonts w:ascii="Arial" w:hAnsi="Arial" w:eastAsia="Microsoft YaHei"/>
+                <w:b w:val="0"/>
+                <w:sz w:val="20"/>
+              </w:rPr>
+              <w:t>3674 笔</w:t>
+            </w:r>
+          </w:p>
+        </w:tc>
+      </w:tr>
+      <w:tr>
+        <w:tc>
+          <w:tcPr>
+            <w:tcW w:type="dxa" w:w="3168"/>
+            <w:vAlign w:val="center"/>
+          </w:tcPr>
+          <w:p>
+            <w:pPr>
+              <w:spacing w:after="0"/>
+              <w:jc w:val="left"/>
+            </w:pPr>
+            <w:r/>
+            <w:r>
+              <w:rPr>
+                <w:rFonts w:ascii="Arial" w:hAnsi="Arial" w:eastAsia="Microsoft YaHei"/>
+                <w:b w:val="0"/>
+                <w:sz w:val="20"/>
+              </w:rPr>
+              <w:t>应收总金额</w:t>
+            </w:r>
+          </w:p>
+        </w:tc>
+        <w:tc>
+          <w:tcPr>
+            <w:tcW w:type="dxa" w:w="5616"/>
+            <w:vAlign w:val="center"/>
+          </w:tcPr>
+          <w:p>
+            <w:pPr>
+              <w:spacing w:after="0"/>
+              <w:jc w:val="left"/>
+            </w:pPr>
+            <w:r/>
+            <w:r>
+              <w:rPr>
+                <w:rFonts w:ascii="Arial" w:hAnsi="Arial" w:eastAsia="Microsoft YaHei"/>
+                <w:b w:val="0"/>
+                <w:sz w:val="20"/>
+              </w:rPr>
+              <w:t>105795.00 元</w:t>
+            </w:r>
+          </w:p>
+        </w:tc>
+      </w:tr>
+      <w:tr>
+        <w:tc>
+          <w:tcPr>
+            <w:tcW w:type="dxa" w:w="3168"/>
+            <w:vAlign w:val="center"/>
+          </w:tcPr>
+          <w:p>
+            <w:pPr>
+              <w:spacing w:after="0"/>
+              <w:jc w:val="left"/>
+            </w:pPr>
+            <w:r/>
+            <w:r>
+              <w:rPr>
+                <w:rFonts w:ascii="Arial" w:hAnsi="Arial" w:eastAsia="Microsoft YaHei"/>
+                <w:b w:val="0"/>
+                <w:sz w:val="20"/>
+              </w:rPr>
+              <w:t>实收总金额</w:t>
+            </w:r>
+          </w:p>
+        </w:tc>
+        <w:tc>
+          <w:tcPr>
+            <w:tcW w:type="dxa" w:w="5616"/>
+            <w:vAlign w:val="center"/>
+          </w:tcPr>
+          <w:p>
+            <w:pPr>
+              <w:spacing w:after="0"/>
+              <w:jc w:val="left"/>
+            </w:pPr>
+            <w:r/>
+            <w:r>
+              <w:rPr>
+                <w:rFonts w:ascii="Arial" w:hAnsi="Arial" w:eastAsia="Microsoft YaHei"/>
+                <w:b w:val="0"/>
+                <w:sz w:val="20"/>
+              </w:rPr>
+              <w:t>57397.50 元</w:t>
+            </w:r>
+          </w:p>
+        </w:tc>
+      </w:tr>
+      <w:tr>
+        <w:tc>
+          <w:tcPr>
+            <w:tcW w:type="dxa" w:w="3168"/>
+            <w:vAlign w:val="center"/>
+          </w:tcPr>
+          <w:p>
+            <w:pPr>
+              <w:spacing w:after="0"/>
+              <w:jc w:val="left"/>
+            </w:pPr>
+            <w:r/>
+            <w:r>
+              <w:rPr>
+                <w:rFonts w:ascii="Arial" w:hAnsi="Arial" w:eastAsia="Microsoft YaHei"/>
+                <w:b w:val="0"/>
+                <w:sz w:val="20"/>
+              </w:rPr>
+              <w:t>实际抵扣总额</w:t>
+            </w:r>
+          </w:p>
+        </w:tc>
+        <w:tc>
+          <w:tcPr>
+            <w:tcW w:type="dxa" w:w="5616"/>
+            <w:vAlign w:val="center"/>
+          </w:tcPr>
+          <w:p>
+            <w:pPr>
+              <w:spacing w:after="0"/>
+              <w:jc w:val="left"/>
+            </w:pPr>
+            <w:r/>
+            <w:r>
+              <w:rPr>
+                <w:rFonts w:ascii="Arial" w:hAnsi="Arial" w:eastAsia="Microsoft YaHei"/>
+                <w:b w:val="0"/>
+                <w:sz w:val="20"/>
+              </w:rPr>
+              <w:t>48285.00 元</w:t>
+            </w:r>
+          </w:p>
+        </w:tc>
+      </w:tr>
+      <w:tr>
+        <w:tc>
+          <w:tcPr>
+            <w:tcW w:type="dxa" w:w="3168"/>
+            <w:vAlign w:val="center"/>
+          </w:tcPr>
+          <w:p>
+            <w:pPr>
+              <w:spacing w:after="0"/>
+              <w:jc w:val="left"/>
+            </w:pPr>
+            <w:r/>
+            <w:r>
+              <w:rPr>
+                <w:rFonts w:ascii="Arial" w:hAnsi="Arial" w:eastAsia="Microsoft YaHei"/>
+                <w:b w:val="0"/>
+                <w:sz w:val="20"/>
+              </w:rPr>
+              <w:t>实收率</w:t>
+            </w:r>
+          </w:p>
+        </w:tc>
+        <w:tc>
+          <w:tcPr>
+            <w:tcW w:type="dxa" w:w="5616"/>
+            <w:vAlign w:val="center"/>
+          </w:tcPr>
+          <w:p>
+            <w:pPr>
+              <w:spacing w:after="0"/>
+              <w:jc w:val="left"/>
+            </w:pPr>
+            <w:r/>
+            <w:r>
+              <w:rPr>
+                <w:rFonts w:ascii="Arial" w:hAnsi="Arial" w:eastAsia="Microsoft YaHei"/>
+                <w:b w:val="0"/>
+                <w:sz w:val="20"/>
+              </w:rPr>
+              <w:t>54.3%</w:t>
+            </w:r>
+          </w:p>
+        </w:tc>
+      </w:tr>
+      <w:tr>
+        <w:tc>
+          <w:tcPr>
+            <w:tcW w:type="dxa" w:w="3168"/>
+            <w:vAlign w:val="center"/>
+          </w:tcPr>
+          <w:p>
+            <w:pPr>
+              <w:spacing w:after="0"/>
+              <w:jc w:val="left"/>
+            </w:pPr>
+            <w:r/>
+            <w:r>
+              <w:rPr>
+                <w:rFonts w:ascii="Arial" w:hAnsi="Arial" w:eastAsia="Microsoft YaHei"/>
+                <w:b w:val="0"/>
+                <w:sz w:val="20"/>
+              </w:rPr>
+              <w:t>主要支付方式</w:t>
+            </w:r>
+          </w:p>
+        </w:tc>
+        <w:tc>
+          <w:tcPr>
+            <w:tcW w:type="dxa" w:w="5616"/>
+            <w:vAlign w:val="center"/>
+          </w:tcPr>
+          <w:p>
+            <w:pPr>
+              <w:spacing w:after="0"/>
+              <w:jc w:val="left"/>
+            </w:pPr>
+            <w:r/>
+            <w:r>
+              <w:rPr>
+                <w:rFonts w:ascii="Arial" w:hAnsi="Arial" w:eastAsia="Microsoft YaHei"/>
+                <w:b w:val="0"/>
+                <w:sz w:val="20"/>
+              </w:rPr>
+              <w:t>微信（1435 笔）</w:t>
+            </w:r>
+          </w:p>
+        </w:tc>
+      </w:tr>
+    </w:tbl>
+    <w:p/>
     <w:p>
+      <w:pPr>
+        <w:pStyle w:val="3"/>
+      </w:pPr>
       <w:r>
-        <w:t>平均停车时长 3.27 小时，最长停车时长 165.45 小时。</w:t>
+        <w:t>二、支付方式与渠道</w:t>
       </w:r>
     </w:p>
     <w:p>
@@ -930,10 +1093,54 @@
     <w:p/>
     <w:p>
       <w:pPr>
-        <w:pStyle w:val="4"/>
+        <w:jc w:val="center"/>
       </w:pPr>
       <w:r>
-        <w:t>停车时长分布</w:t>
+        <w:drawing>
+          <wp:inline xmlns:a="http://schemas.openxmlformats.org/drawingml/2006/main" xmlns:pic="http://schemas.openxmlformats.org/drawingml/2006/picture">
+            <wp:extent cx="5029200" cy="2117558"/>
+            <wp:docPr id="1" name="Picture 1"/>
+            <wp:cNvGraphicFramePr>
+              <a:graphicFrameLocks noChangeAspect="1"/>
+            </wp:cNvGraphicFramePr>
+            <a:graphic>
+              <a:graphicData uri="http://schemas.openxmlformats.org/drawingml/2006/picture">
+                <pic:pic>
+                  <pic:nvPicPr>
+                    <pic:cNvPr id="0" name="sample-payment-methods.png"/>
+                    <pic:cNvPicPr/>
+                  </pic:nvPicPr>
+                  <pic:blipFill>
+                    <a:blip r:embed="rId5"/>
+                    <a:stretch>
+                      <a:fillRect/>
+                    </a:stretch>
+                  </pic:blipFill>
+                  <pic:spPr>
+                    <a:xfrm>
+                      <a:off x="0" y="0"/>
+                      <a:ext cx="5029200" cy="2117558"/>
+                    </a:xfrm>
+                    <a:prstGeom prst="rect"/>
+                  </pic:spPr>
+                </pic:pic>
+              </a:graphicData>
+            </a:graphic>
+          </wp:inline>
+        </w:drawing>
+      </w:r>
+    </w:p>
+    <w:p>
+      <w:pPr>
+        <w:pStyle w:val="3"/>
+      </w:pPr>
+      <w:r>
+        <w:t>三、停车时长分析</w:t>
+      </w:r>
+    </w:p>
+    <w:p>
+      <w:r>
+        <w:t>平均停车时长 3.27 小时，最长停车时长 165.45 小时。</w:t>
       </w:r>
     </w:p>
     <w:tbl>
@@ -1324,7 +1531,7 @@
         <w:drawing>
           <wp:inline xmlns:a="http://schemas.openxmlformats.org/drawingml/2006/main" xmlns:pic="http://schemas.openxmlformats.org/drawingml/2006/picture">
             <wp:extent cx="5029200" cy="2117558"/>
-            <wp:docPr id="1" name="Picture 1"/>
+            <wp:docPr id="2" name="Picture 2"/>
             <wp:cNvGraphicFramePr>
               <a:graphicFrameLocks noChangeAspect="1"/>
             </wp:cNvGraphicFramePr>
@@ -1332,7 +1539,7 @@
               <a:graphicData uri="http://schemas.openxmlformats.org/drawingml/2006/picture">
                 <pic:pic>
                   <pic:nvPicPr>
-                    <pic:cNvPr id="0" name="sample-payment-methods.png"/>
+                    <pic:cNvPr id="0" name="sample-duration-bins.png"/>
                     <pic:cNvPicPr/>
                   </pic:nvPicPr>
                   <pic:blipFill>
@@ -1363,7 +1570,7 @@
         <w:drawing>
           <wp:inline xmlns:a="http://schemas.openxmlformats.org/drawingml/2006/main" xmlns:pic="http://schemas.openxmlformats.org/drawingml/2006/picture">
             <wp:extent cx="5029200" cy="2117558"/>
-            <wp:docPr id="2" name="Picture 2"/>
+            <wp:docPr id="3" name="Picture 3"/>
             <wp:cNvGraphicFramePr>
               <a:graphicFrameLocks noChangeAspect="1"/>
             </wp:cNvGraphicFramePr>
@@ -1371,7 +1578,7 @@
               <a:graphicData uri="http://schemas.openxmlformats.org/drawingml/2006/picture">
                 <pic:pic>
                   <pic:nvPicPr>
-                    <pic:cNvPr id="0" name="sample-duration-bins.png"/>
+                    <pic:cNvPr id="0" name="sample-entry-hours.png"/>
                     <pic:cNvPicPr/>
                   </pic:nvPicPr>
                   <pic:blipFill>
@@ -1396,25 +1603,41 @@
     </w:p>
     <w:p>
       <w:pPr>
-        <w:pStyle w:val="3"/>
+        <w:jc w:val="center"/>
       </w:pPr>
       <w:r>
-        <w:t>三、补充观察</w:t>
-      </w:r>
-    </w:p>
-    <w:p>
-      <w:r>
-        <w:t>· 线上支付渠道交易 3122 笔，是当前最主要的支付入口。</w:t>
-      </w:r>
-    </w:p>
-    <w:p>
-      <w:r>
-        <w:t>· 实际抵扣总额 48285.0 元，应结合会员和优惠策略复盘抵扣效率。</w:t>
-      </w:r>
-    </w:p>
-    <w:p>
-      <w:r>
-        <w:t>· 最长停车时长 165.45 小时，长停车辆需要单独关注。</w:t>
+        <w:drawing>
+          <wp:inline xmlns:a="http://schemas.openxmlformats.org/drawingml/2006/main" xmlns:pic="http://schemas.openxmlformats.org/drawingml/2006/picture">
+            <wp:extent cx="5029200" cy="2117558"/>
+            <wp:docPr id="4" name="Picture 4"/>
+            <wp:cNvGraphicFramePr>
+              <a:graphicFrameLocks noChangeAspect="1"/>
+            </wp:cNvGraphicFramePr>
+            <a:graphic>
+              <a:graphicData uri="http://schemas.openxmlformats.org/drawingml/2006/picture">
+                <pic:pic>
+                  <pic:nvPicPr>
+                    <pic:cNvPr id="0" name="sample-charge-hours.png"/>
+                    <pic:cNvPicPr/>
+                  </pic:nvPicPr>
+                  <pic:blipFill>
+                    <a:blip r:embed="rId10"/>
+                    <a:stretch>
+                      <a:fillRect/>
+                    </a:stretch>
+                  </pic:blipFill>
+                  <pic:spPr>
+                    <a:xfrm>
+                      <a:off x="0" y="0"/>
+                      <a:ext cx="5029200" cy="2117558"/>
+                    </a:xfrm>
+                    <a:prstGeom prst="rect"/>
+                  </pic:spPr>
+                </pic:pic>
+              </a:graphicData>
+            </a:graphic>
+          </wp:inline>
+        </w:drawing>
       </w:r>
     </w:p>
     <w:p>
@@ -1422,22 +1645,50 @@
         <w:pStyle w:val="3"/>
       </w:pPr>
       <w:r>
-        <w:t>四、管理建议</w:t>
+        <w:t>四、补充观察</w:t>
       </w:r>
     </w:p>
     <w:p>
       <w:r>
-        <w:t>1. 按支付方式和渠道建立周度监控，优先排查高抵扣低实收组合。</w:t>
+        <w:t>· 应收 105795.00 元、实收 57397.50 元，缺口 48397.50 元；其中实际抵扣 48285.00 元，占应收 45.6%，是实收率仅 54.3% 的主因，属于可量化的收入让利敞口。</w:t>
       </w:r>
     </w:p>
     <w:p>
       <w:r>
-        <w:t>2. 对长时间停车记录设置运营复核清单，减少异常占位和漏收风险。</w:t>
+        <w:t>· 优惠类支付（会员积分 1396 笔、优惠券 777 笔）合计 2173 笔，占总交易 59.1%，免费 / 优惠敞口较大，需评估其对实收的拉低作用。</w:t>
       </w:r>
     </w:p>
     <w:p>
       <w:r>
-        <w:t>3. 将优惠券、会员积分的抵扣效果与复购指标绑定，避免只看交易笔数。</w:t>
+        <w:t>· 停车超过 12 小时的记录 78 笔，最长 165.45 小时，存在长期占位或异常滞留，建议单独核查。</w:t>
+      </w:r>
+    </w:p>
+    <w:p>
+      <w:pPr>
+        <w:pStyle w:val="3"/>
+      </w:pPr>
+      <w:r>
+        <w:t>五、结论与建议</w:t>
+      </w:r>
+    </w:p>
+    <w:p>
+      <w:r>
+        <w:t>1. 针对抵扣金额最大的支付方式（会员积分 / 优惠券）单列台账，按周复盘让利成本与回报。</w:t>
+      </w:r>
+    </w:p>
+    <w:p>
+      <w:r>
+        <w:t>2. 对停车超过 12 小时的记录设置运营复核清单，减少异常占位和漏收风险。</w:t>
+      </w:r>
+    </w:p>
+    <w:p>
+      <w:r>
+        <w:t>3. 将优惠券、会员积分的抵扣效果与复购、客流指标绑定，避免只看交易笔数。</w:t>
+      </w:r>
+    </w:p>
+    <w:p>
+      <w:r>
+        <w:t>4. 建立应收—实收—抵扣的周度对账，把实收率作为核心经营指标持续监控。</w:t>
       </w:r>
     </w:p>
     <w:sectPr>

</xml_diff>